<commit_message>
Quality terminate: Aufmerksamkeitspruefung terminiert im Feld
Neuer Branch in beiden Fassungen, direkt hinter dem Alters-Screen-out und
damit vor den drei Markenrastern: attention < 90 fuehrt ueber ein
End-of-Survey-Element mit EndingType Advanced zur Rueckleitung mit
ergebnis=42. Die Reihenfolge ist bindend, sonst bekaemen unter 18-Jaehrige
den falschen Ausgangscode.

Bisher terminierte das Item nicht, der Ausschluss erfolgte in der
Aufbereitung. Codebuch 3c und die Panel-Anbindung sind entsprechend
umgeschrieben, README und beide .docx nachgezogen.

Co-Authored-By: Claude Opus 5 <noreply@anthropic.com>
Claude-Session: https://claude.ai/code/session_01Ea1G2EV9dEwvTz8t52fyCd
</commit_message>
<xml_diff>
--- a/NEOH_AT_Sep2026.docx
+++ b/NEOH_AT_Sep2026.docx
@@ -44,7 +44,7 @@
         <w:ind w:left="240"/>
       </w:pPr>
       <w:r>
-        <w:t xml:space="preserve">Embedded Data: land = AT, PID = undefined</w:t>
+        <w:t xml:space="preserve">Embedded Data: land = AT, PID (aus URL gesetzt)</w:t>
       </w:r>
     </w:p>
     <w:p>
@@ -72,6 +72,24 @@
       </w:pPr>
       <w:r>
         <w:t xml:space="preserve">Branch — Screen-out: unter 18 Jahre: wenn alter = Unter 18 Jahre (1) ausgewählt</w:t>
+      </w:r>
+    </w:p>
+    <w:p>
+      <w:pPr>
+        <w:spacing w:after="60" w:before="0"/>
+        <w:ind w:left="480"/>
+      </w:pPr>
+      <w:r>
+        <w:t xml:space="preserve">→ Ende der Umfrage</w:t>
+      </w:r>
+    </w:p>
+    <w:p>
+      <w:pPr>
+        <w:spacing w:after="60" w:before="0"/>
+        <w:ind w:left="240"/>
+      </w:pPr>
+      <w:r>
+        <w:t xml:space="preserve">Branch — Quality terminate: Aufmerksamkeitsprüfung nicht bestanden: wenn attention kleiner als 90</w:t>
       </w:r>
     </w:p>
     <w:p>

</xml_diff>